<commit_message>
Modificando archivo de Certificado
</commit_message>
<xml_diff>
--- a/public/plantillas/CERTIFICADO_MEDICO.docx
+++ b/public/plantillas/CERTIFICADO_MEDICO.docx
@@ -464,7 +464,23 @@
           <w:sz w:val="30"/>
           <w:szCs w:val="30"/>
         </w:rPr>
-        <w:t xml:space="preserve"> ENCONTRO EN BUENAS CONCIDIONES DE SALUD TANTO </w:t>
+        <w:t xml:space="preserve"> ENCONTRO EN BUENAS </w:t>
+      </w:r>
+      <w:r>
+        <w:rPr>
+          <w:rFonts w:cstheme="minorHAnsi"/>
+          <w:sz w:val="30"/>
+          <w:szCs w:val="30"/>
+        </w:rPr>
+        <w:t>CONDICIONES</w:t>
+      </w:r>
+      <w:r>
+        <w:rPr>
+          <w:rFonts w:cstheme="minorHAnsi"/>
+          <w:sz w:val="30"/>
+          <w:szCs w:val="30"/>
+        </w:rPr>
+        <w:t xml:space="preserve"> DE SALUD TANTO </w:t>
       </w:r>
       <w:r>
         <w:rPr>
@@ -564,7 +580,23 @@
           <w:sz w:val="30"/>
           <w:szCs w:val="30"/>
         </w:rPr>
-        <w:t xml:space="preserve"> PARA LOS USOS </w:t>
+        <w:t xml:space="preserve"> PARA LOS USOS</w:t>
+      </w:r>
+      <w:r>
+        <w:rPr>
+          <w:rFonts w:cstheme="minorHAnsi"/>
+          <w:sz w:val="30"/>
+          <w:szCs w:val="30"/>
+        </w:rPr>
+        <w:t xml:space="preserve"> O</w:t>
+      </w:r>
+      <w:r>
+        <w:rPr>
+          <w:rFonts w:cstheme="minorHAnsi"/>
+          <w:sz w:val="30"/>
+          <w:szCs w:val="30"/>
+        </w:rPr>
+        <w:t xml:space="preserve"> </w:t>
       </w:r>
       <w:r>
         <w:rPr>
@@ -605,22 +637,6 @@
           <w:szCs w:val="30"/>
         </w:rPr>
         <w:t xml:space="preserve"> </w:t>
-      </w:r>
-      <w:r>
-        <w:rPr>
-          <w:rFonts w:cstheme="minorHAnsi"/>
-          <w:sz w:val="30"/>
-          <w:szCs w:val="30"/>
-        </w:rPr>
-        <w:t xml:space="preserve">A </w:t>
-      </w:r>
-      <w:r>
-        <w:rPr>
-          <w:rFonts w:cstheme="minorHAnsi"/>
-          <w:sz w:val="30"/>
-          <w:szCs w:val="30"/>
-        </w:rPr>
-        <w:t xml:space="preserve">LOS </w:t>
       </w:r>
       <w:r>
         <w:rPr>

</xml_diff>